<commit_message>
docs: give the tutor Mr. Jiayue Long dedicated, prominent credit in the internship report
</commit_message>
<xml_diff>
--- a/docs/Practical-Training-Internship-Report.docx
+++ b/docs/Practical-Training-Internship-Report.docx
@@ -2438,6 +2438,27 @@
           <w:sz w:val="24"/>
           <w:szCs w:val="24"/>
         </w:rPr>
+        <w:t>Throughout the four weeks our tutor, Mr. Jiayue Long, guided us at every step: he reviewed our progress each week and always made us see clearly which part of the project was the real problem and which part we should develop next, which shaped our priorities, kept the work on track and taught us to evaluate our own progress critically.</w:t>
+      </w:r>
+    </w:p>
+    <w:p>
+      <w:pPr>
+        <w:pStyle w:val="16"/>
+        <w:ind w:left="720"/>
+        <w:rPr>
+          <w:rFonts w:hint="eastAsia" w:ascii="Times New Roman" w:hAnsi="Times New Roman" w:cs="Times New Roman"/>
+          <w:color w:val="FF0000"/>
+          <w:sz w:val="24"/>
+          <w:szCs w:val="24"/>
+        </w:rPr>
+      </w:pPr>
+      <w:r>
+        <w:rPr>
+          <w:rFonts w:ascii="Times New Roman" w:hAnsi="Times New Roman" w:cs="Times New Roman"/>
+          <w:color w:val="FF0000"/>
+          <w:sz w:val="24"/>
+          <w:szCs w:val="24"/>
+        </w:rPr>
         <w:t>This was a team project - Team Algorists - and I served as the team leader. I coordinated the weekly plan, distributed the modules among the members, reviewed and merged my teammates' work, and integrated the final deliverables. Teamwork allowed the project to achieve both breadth (a complete e-commerce platform) and depth (a genuine, explainable AI trust feature). We completed the system, wrote the full documentation and successfully delivered the final presentation.</w:t>
       </w:r>
     </w:p>
@@ -2561,7 +2582,24 @@
           <w:kern w:val="0"/>
           <w:sz w:val="24"/>
         </w:rPr>
-        <w:t>Communication and public speaking. Presenting our project to the class was a genuinely new experience. I had to explain a technically deep idea - an explainable AI trust score - to an audience in only a few minutes, which forced me to find clear language, to prioritise what mattered, and to prepare visual material (a 14-slide deck) instead of relying on jargon. Answering questions afterwards taught me to think on my feet and to be honest about the limits of what we had built. Our tutor, Mr. Long Jiayue, played an important part in this growth: he never simply handed us the answer, but always pointed out exactly which part of the project was the real problem and which part we should develop next, which taught us to diagnose our own work instead of waiting for a verdict.</w:t>
+        <w:t>Communication and public speaking. Presenting our project to the class was a genuinely new experience. I had to explain a technically deep idea - an explainable AI trust score - to an audience in only a few minutes, which forced me to find clear language, to prioritise what mattered, and to prepare visual material (a 14-slide deck) instead of relying on jargon. Answering questions afterwards taught me to think on my feet and to be honest about the limits of what we had built.</w:t>
+      </w:r>
+    </w:p>
+    <w:p>
+      <w:pPr>
+        <w:rPr>
+          <w:color w:val="FF0000"/>
+          <w:kern w:val="0"/>
+          <w:sz w:val="24"/>
+        </w:rPr>
+      </w:pPr>
+      <w:r>
+        <w:rPr>
+          <w:color w:val="FF0000"/>
+          <w:kern w:val="0"/>
+          <w:sz w:val="24"/>
+        </w:rPr>
+        <w:t>Guidance from our tutor. Our tutor, Mr. Jiayue Long, was the person who shaped this project the most, and I am sincerely grateful to him. Every week he reviewed our progress and, rather than simply giving us the answer, he always made us see exactly which part of the project was the real problem and which part we should develop next, so we gradually learned to diagnose our own work instead of waiting for a verdict. He was endlessly patient with our questions, encouraged us whenever a feature did not work, and shared his real-world experience of how professional software teams plan, build, test and present their work. He also held us to a higher standard, pushing us to make the AI feature genuinely explainable instead of a black box and to document and present our work properly. His guidance, encouragement and kindness gave us the confidence to finish the project, and a great deal of what we achieved comes directly from the direction he gave us.</w:t>
       </w:r>
     </w:p>
     <w:p>

</xml_diff>